<commit_message>
Clarify Clientix pilot project status
</commit_message>
<xml_diff>
--- a/docs/Green_Clinic_Clientix_Integration.docx
+++ b/docs/Green_Clinic_Clientix_Integration.docx
@@ -89,6 +89,56 @@
                 <w:sz w:val="22"/>
               </w:rPr>
               <w:t>готовый read-only API. Любое обновление Green Clinic в Supabase становится доступно в Штурмане без ручного импорта файлов.</w:t>
+            </w:r>
+          </w:p>
+        </w:tc>
+      </w:tr>
+    </w:tbl>
+    <w:tbl>
+      <w:tblPr>
+        <w:tblW w:type="dxa" w:w="7920"/>
+        <w:jc w:val="left"/>
+        <w:tblLayout w:type="fixed"/>
+        <w:tblLook w:firstColumn="1" w:firstRow="1" w:lastColumn="0" w:lastRow="0" w:noHBand="0" w:noVBand="1" w:val="04A0"/>
+        <w:tblInd w:w="120" w:type="dxa"/>
+      </w:tblPr>
+      <w:tblGrid>
+        <w:gridCol w:w="9936"/>
+      </w:tblGrid>
+      <w:tr>
+        <w:tc>
+          <w:tcPr>
+            <w:tcW w:type="dxa" w:w="7920"/>
+            <w:tcMar>
+              <w:top w:w="80" w:type="dxa"/>
+              <w:start w:w="120" w:type="dxa"/>
+              <w:bottom w:w="80" w:type="dxa"/>
+              <w:end w:w="120" w:type="dxa"/>
+            </w:tcMar>
+            <w:vAlign w:val="center"/>
+            <w:shd w:fill="FFF8E8"/>
+          </w:tcPr>
+          <w:p>
+            <w:pPr>
+              <w:spacing w:after="0"/>
+            </w:pPr>
+            <w:r>
+              <w:rPr>
+                <w:rFonts w:ascii="Calibri" w:hAnsi="Calibri"/>
+                <w:b/>
+                <w:color w:val="7A5A00"/>
+                <w:sz w:val="21"/>
+              </w:rPr>
+              <w:t xml:space="preserve">Статус проекта: </w:t>
+            </w:r>
+            <w:r>
+              <w:rPr>
+                <w:rFonts w:ascii="Calibri" w:hAnsi="Calibri"/>
+                <w:b w:val="0"/>
+                <w:color w:val="7A5A00"/>
+                <w:sz w:val="21"/>
+              </w:rPr>
+              <w:t>база знаний находится в разработке и ежедневно пополняется новыми карточками. Текущая структура не окончательная; это рабочий пилотный проект. При интеграции не фиксируйте жёстко набор разделов или полей — используйте API-ответы как источник актуальной структуры.</w:t>
             </w:r>
           </w:p>
         </w:tc>

</xml_diff>